<commit_message>
Finish Partition Page Details
</commit_message>
<xml_diff>
--- a/assets/CSProjects/CS270/CS270-Final/Write Up.docx
+++ b/assets/CSProjects/CS270/CS270-Final/Write Up.docx
@@ -44,13 +44,7 @@
       </w:r>
       <w:r>
         <w:br/>
-        <w:t xml:space="preserve">• Algorithm 2: A tree-based dynamic programming approach that uses a binary splitting tree of linked-list nodes and then chooses partitions via a </w:t>
-      </w:r>
-      <w:r>
-        <w:t>memorized</w:t>
-      </w:r>
-      <w:r>
-        <w:t xml:space="preserve"> decision procedure. </w:t>
+        <w:t xml:space="preserve">• Algorithm 2: A tree-based dynamic programming approach that uses a binary splitting tree of linked-list nodes and then chooses partitions via a memorized decision procedure. </w:t>
       </w:r>
     </w:p>
     <w:p>
@@ -130,9 +124,11 @@
       <w:r>
         <w:t>(</w:t>
       </w:r>
+      <w:proofErr w:type="spellStart"/>
       <w:r>
         <w:t>i</w:t>
       </w:r>
+      <w:proofErr w:type="spellEnd"/>
       <w:r>
         <w:t>)</w:t>
       </w:r>
@@ -140,7 +136,15 @@
         <w:t>, sum(</w:t>
       </w:r>
       <w:r>
-        <w:t>P(i)</w:t>
+        <w:t>P(</w:t>
+      </w:r>
+      <w:proofErr w:type="spellStart"/>
+      <w:r>
+        <w:t>i</w:t>
+      </w:r>
+      <w:proofErr w:type="spellEnd"/>
+      <w:r>
+        <w:t>)</w:t>
       </w:r>
       <w:r>
         <w:t>) ≥ k.</w:t>
@@ -157,7 +161,15 @@
         <w:t xml:space="preserve">Diversity constraint: For each partition </w:t>
       </w:r>
       <w:r>
-        <w:t>P(i)</w:t>
+        <w:t>P(</w:t>
+      </w:r>
+      <w:proofErr w:type="spellStart"/>
+      <w:r>
+        <w:t>i</w:t>
+      </w:r>
+      <w:proofErr w:type="spellEnd"/>
+      <w:r>
+        <w:t>)</w:t>
       </w:r>
       <w:r>
         <w:t>, there are at least l indices j for which P</w:t>
@@ -165,9 +177,11 @@
       <w:r>
         <w:t>(</w:t>
       </w:r>
+      <w:proofErr w:type="spellStart"/>
       <w:r>
         <w:t>i</w:t>
       </w:r>
+      <w:proofErr w:type="spellEnd"/>
       <w:r>
         <w:t>)</w:t>
       </w:r>
@@ -186,10 +200,26 @@
         <w:t xml:space="preserve">Reconstruction property: For every index j, the sum of </w:t>
       </w:r>
       <w:r>
-        <w:t>P(i)</w:t>
-      </w:r>
-      <w:r>
-        <w:t>[j] over all partitions i equals the original a</w:t>
+        <w:t>P(</w:t>
+      </w:r>
+      <w:proofErr w:type="spellStart"/>
+      <w:r>
+        <w:t>i</w:t>
+      </w:r>
+      <w:proofErr w:type="spellEnd"/>
+      <w:r>
+        <w:t>)</w:t>
+      </w:r>
+      <w:r>
+        <w:t xml:space="preserve">[j] over all partitions </w:t>
+      </w:r>
+      <w:proofErr w:type="spellStart"/>
+      <w:r>
+        <w:t>i</w:t>
+      </w:r>
+      <w:proofErr w:type="spellEnd"/>
+      <w:r>
+        <w:t xml:space="preserve"> equals the original a</w:t>
       </w:r>
       <w:r>
         <w:t>(</w:t>
@@ -266,7 +296,15 @@
         </w:numPr>
       </w:pPr>
       <w:r>
-        <w:t>It attempts to build a single valid partition using the procedure build_one_partition.</w:t>
+        <w:t xml:space="preserve">It attempts to build a single valid partition using the procedure </w:t>
+      </w:r>
+      <w:proofErr w:type="spellStart"/>
+      <w:r>
+        <w:t>build_one_partition</w:t>
+      </w:r>
+      <w:proofErr w:type="spellEnd"/>
+      <w:r>
+        <w:t>.</w:t>
       </w:r>
     </w:p>
     <w:p>
@@ -330,19 +368,75 @@
     </w:p>
     <w:p>
       <w:r>
-        <w:t>• partition_sum(partition): Returns the sum of the partition.</w:t>
-      </w:r>
-      <w:r>
-        <w:br/>
-        <w:t>• partition_diversity(partition): Counts how many indices in the partition are strictly positive.</w:t>
-      </w:r>
-      <w:r>
-        <w:br/>
-        <w:t>• check_reconstruction(partitions, original): Verifies that summing all partitions index-wise reconstructs the original list.</w:t>
-      </w:r>
-      <w:r>
-        <w:br/>
-        <w:t>• build_one_partition(remaining, k, l): Attempts to construct a single valid partition, using a local copy (temp_remaining) so the algorithm can abort cleanly if it fails.</w:t>
+        <w:t xml:space="preserve">• </w:t>
+      </w:r>
+      <w:proofErr w:type="spellStart"/>
+      <w:r>
+        <w:t>partition_sum</w:t>
+      </w:r>
+      <w:proofErr w:type="spellEnd"/>
+      <w:r>
+        <w:t>(partition): Returns the sum of the partition.</w:t>
+      </w:r>
+      <w:r>
+        <w:br/>
+        <w:t xml:space="preserve">• </w:t>
+      </w:r>
+      <w:proofErr w:type="spellStart"/>
+      <w:r>
+        <w:t>partition_diversity</w:t>
+      </w:r>
+      <w:proofErr w:type="spellEnd"/>
+      <w:r>
+        <w:t>(partition): Counts how many indices in the partition are strictly positive.</w:t>
+      </w:r>
+      <w:r>
+        <w:br/>
+        <w:t xml:space="preserve">• </w:t>
+      </w:r>
+      <w:proofErr w:type="spellStart"/>
+      <w:r>
+        <w:t>check_</w:t>
+      </w:r>
+      <w:proofErr w:type="gramStart"/>
+      <w:r>
+        <w:t>reconstruction</w:t>
+      </w:r>
+      <w:proofErr w:type="spellEnd"/>
+      <w:r>
+        <w:t>(</w:t>
+      </w:r>
+      <w:proofErr w:type="gramEnd"/>
+      <w:r>
+        <w:t>partitions, original): Verifies that summing all partitions index-wise reconstructs the original list.</w:t>
+      </w:r>
+      <w:r>
+        <w:br/>
+        <w:t xml:space="preserve">• </w:t>
+      </w:r>
+      <w:proofErr w:type="spellStart"/>
+      <w:r>
+        <w:t>build_one_</w:t>
+      </w:r>
+      <w:proofErr w:type="gramStart"/>
+      <w:r>
+        <w:t>partition</w:t>
+      </w:r>
+      <w:proofErr w:type="spellEnd"/>
+      <w:r>
+        <w:t>(</w:t>
+      </w:r>
+      <w:proofErr w:type="gramEnd"/>
+      <w:r>
+        <w:t>remaining, k, l): Attempts to construct a single valid partition, using a local copy (</w:t>
+      </w:r>
+      <w:proofErr w:type="spellStart"/>
+      <w:r>
+        <w:t>temp_remaining</w:t>
+      </w:r>
+      <w:proofErr w:type="spellEnd"/>
+      <w:r>
+        <w:t>) so the algorithm can abort cleanly if it fails.</w:t>
       </w:r>
     </w:p>
     <w:p>
@@ -352,13 +446,31 @@
     </w:p>
     <w:p>
       <w:r>
-        <w:t xml:space="preserve">• greedy_partition_algorithm(values, k, l): Repeatedly calls build_one_partition until no more valid partitions can be created, folds leftover mass into an existing </w:t>
-      </w:r>
-      <w:r>
-        <w:t>partition,</w:t>
-      </w:r>
-      <w:r>
-        <w:t xml:space="preserve"> if possible, runs the reconstruction check, and returns success status plus the list of partitions.</w:t>
+        <w:t xml:space="preserve">• </w:t>
+      </w:r>
+      <w:proofErr w:type="spellStart"/>
+      <w:r>
+        <w:t>greedy_partition_</w:t>
+      </w:r>
+      <w:proofErr w:type="gramStart"/>
+      <w:r>
+        <w:t>algorithm</w:t>
+      </w:r>
+      <w:proofErr w:type="spellEnd"/>
+      <w:r>
+        <w:t>(</w:t>
+      </w:r>
+      <w:proofErr w:type="gramEnd"/>
+      <w:r>
+        <w:t xml:space="preserve">values, k, l): Repeatedly calls </w:t>
+      </w:r>
+      <w:proofErr w:type="spellStart"/>
+      <w:r>
+        <w:t>build_one_partition</w:t>
+      </w:r>
+      <w:proofErr w:type="spellEnd"/>
+      <w:r>
+        <w:t xml:space="preserve"> until no more valid partitions can be created, folds leftover mass into an existing partition, if possible, runs the reconstruction check, and returns success status plus the list of partitions.</w:t>
       </w:r>
     </w:p>
     <w:p>
@@ -377,7 +489,15 @@
       </w:r>
       <w:r>
         <w:br/>
-        <w:t xml:space="preserve">• Prints either a failure message or the list of partitions, along with a reconstruction check and average runtime using the timeit module. </w:t>
+        <w:t xml:space="preserve">• Prints either a failure message or the list of partitions, along with a reconstruction check and average runtime using the </w:t>
+      </w:r>
+      <w:proofErr w:type="spellStart"/>
+      <w:r>
+        <w:t>timeit</w:t>
+      </w:r>
+      <w:proofErr w:type="spellEnd"/>
+      <w:r>
+        <w:t xml:space="preserve"> module. </w:t>
       </w:r>
     </w:p>
     <w:p>
@@ -425,7 +545,15 @@
       </w:r>
       <w:r>
         <w:br/>
-        <w:t xml:space="preserve">• When partitioning stops, any leftover is added back into an existing partition, and check_reconstruction confirms that summing the partitions index-wise reproduces the original list. </w:t>
+        <w:t xml:space="preserve">• When partitioning stops, any leftover is added back into an existing partition, and </w:t>
+      </w:r>
+      <w:proofErr w:type="spellStart"/>
+      <w:r>
+        <w:t>check_reconstruction</w:t>
+      </w:r>
+      <w:proofErr w:type="spellEnd"/>
+      <w:r>
+        <w:t xml:space="preserve"> confirms that summing the partitions index-wise reproduces the original list. </w:t>
       </w:r>
     </w:p>
     <w:p>
@@ -476,13 +604,29 @@
     </w:p>
     <w:p>
       <w:r>
-        <w:t>In the worst case, the number of iterations across all partitions is on the order of S, since each iteration decreases the total remaining sum by exactly 1. Each iteration requires an O(n) scan, so a rough upper bound is:</w:t>
+        <w:t xml:space="preserve">In the worst case, the number of iterations across all partitions is </w:t>
+      </w:r>
+      <w:proofErr w:type="gramStart"/>
+      <w:r>
+        <w:t>on</w:t>
+      </w:r>
+      <w:proofErr w:type="gramEnd"/>
+      <w:r>
+        <w:t xml:space="preserve"> the order of S, since each iteration decreases the total remaining sum by exactly 1. Each iteration requires an O(n) scan, so a rough upper bound is:</w:t>
       </w:r>
     </w:p>
     <w:p>
       <w:r>
         <w:lastRenderedPageBreak/>
-        <w:t>Time complexity ≈ O(n * S)</w:t>
+        <w:t xml:space="preserve">Time complexity ≈ </w:t>
+      </w:r>
+      <w:proofErr w:type="gramStart"/>
+      <w:r>
+        <w:t>O(</w:t>
+      </w:r>
+      <w:proofErr w:type="gramEnd"/>
+      <w:r>
+        <w:t>n * S)</w:t>
       </w:r>
     </w:p>
     <w:p>
@@ -570,7 +714,23 @@
         </w:numPr>
       </w:pPr>
       <w:r>
-        <w:t xml:space="preserve">The original list of integers is first converted into a linked list (ListNode). This is then turned into the root of a binary tree (TreeNode), where each node stores a linked list. </w:t>
+        <w:t>The original list of integers is first converted into a linked list (</w:t>
+      </w:r>
+      <w:proofErr w:type="spellStart"/>
+      <w:r>
+        <w:t>ListNode</w:t>
+      </w:r>
+      <w:proofErr w:type="spellEnd"/>
+      <w:r>
+        <w:t>). This is then turned into the root of a binary tree (</w:t>
+      </w:r>
+      <w:proofErr w:type="spellStart"/>
+      <w:r>
+        <w:t>TreeNode</w:t>
+      </w:r>
+      <w:proofErr w:type="spellEnd"/>
+      <w:r>
+        <w:t xml:space="preserve">), where each node stores a linked list. </w:t>
       </w:r>
     </w:p>
     <w:p>
@@ -592,7 +752,23 @@
         </w:numPr>
       </w:pPr>
       <w:r>
-        <w:t>Once the tree is built, a dynamic programming function compute_best_partitions decides, for every TreeNode, whether it is better to:</w:t>
+        <w:t xml:space="preserve">Once the tree is built, a dynamic programming function </w:t>
+      </w:r>
+      <w:proofErr w:type="spellStart"/>
+      <w:r>
+        <w:t>compute_best_partitions</w:t>
+      </w:r>
+      <w:proofErr w:type="spellEnd"/>
+      <w:r>
+        <w:t xml:space="preserve"> decides, for every </w:t>
+      </w:r>
+      <w:proofErr w:type="spellStart"/>
+      <w:r>
+        <w:t>TreeNode</w:t>
+      </w:r>
+      <w:proofErr w:type="spellEnd"/>
+      <w:r>
+        <w:t>, whether it is better to:</w:t>
       </w:r>
       <w:r>
         <w:br/>
@@ -611,7 +787,20 @@
         </w:numPr>
       </w:pPr>
       <w:r>
-        <w:t>A separate function collect_partitions then walks the tree according to these choices and produces the final list of partitions.</w:t>
+        <w:t xml:space="preserve">A separate function </w:t>
+      </w:r>
+      <w:proofErr w:type="spellStart"/>
+      <w:proofErr w:type="gramStart"/>
+      <w:r>
+        <w:t>collect</w:t>
+      </w:r>
+      <w:proofErr w:type="gramEnd"/>
+      <w:r>
+        <w:t>_partitions</w:t>
+      </w:r>
+      <w:proofErr w:type="spellEnd"/>
+      <w:r>
+        <w:t xml:space="preserve"> then walks the tree according to these choices and produces the final list of partitions.</w:t>
       </w:r>
     </w:p>
     <w:p>
@@ -630,24 +819,74 @@
     </w:p>
     <w:p>
       <w:r>
-        <w:t xml:space="preserve">The algorithm uses three core data structures: </w:t>
-      </w:r>
-    </w:p>
-    <w:p>
-      <w:r>
-        <w:t>• ListNode: A singly linked list node storing a single integer and a pointer to the next node.</w:t>
-      </w:r>
-      <w:r>
-        <w:br/>
-        <w:t>• TreeNode: A binary tree node storing:</w:t>
-      </w:r>
-      <w:r>
-        <w:br/>
-        <w:t>– list_head: the head of a linked list (the current “collection” at this node).</w:t>
-      </w:r>
-      <w:r>
-        <w:br/>
-        <w:t>– left, right: pointers to child TreeNodes.</w:t>
+        <w:t xml:space="preserve">The algorithm uses </w:t>
+      </w:r>
+      <w:proofErr w:type="gramStart"/>
+      <w:r>
+        <w:t>three core</w:t>
+      </w:r>
+      <w:proofErr w:type="gramEnd"/>
+      <w:r>
+        <w:t xml:space="preserve"> data structures: </w:t>
+      </w:r>
+    </w:p>
+    <w:p>
+      <w:r>
+        <w:t xml:space="preserve">• </w:t>
+      </w:r>
+      <w:proofErr w:type="spellStart"/>
+      <w:r>
+        <w:t>ListNode</w:t>
+      </w:r>
+      <w:proofErr w:type="spellEnd"/>
+      <w:r>
+        <w:t>: A singly linked list node storing a single integer and a pointer to the next node.</w:t>
+      </w:r>
+      <w:r>
+        <w:br/>
+        <w:t xml:space="preserve">• </w:t>
+      </w:r>
+      <w:proofErr w:type="spellStart"/>
+      <w:r>
+        <w:t>TreeNode</w:t>
+      </w:r>
+      <w:proofErr w:type="spellEnd"/>
+      <w:r>
+        <w:t>: A binary tree node storing:</w:t>
+      </w:r>
+      <w:r>
+        <w:br/>
+      </w:r>
+      <w:r>
+        <w:t xml:space="preserve">      </w:t>
+      </w:r>
+      <w:r>
+        <w:t xml:space="preserve">– </w:t>
+      </w:r>
+      <w:proofErr w:type="spellStart"/>
+      <w:r>
+        <w:t>list_head</w:t>
+      </w:r>
+      <w:proofErr w:type="spellEnd"/>
+      <w:r>
+        <w:t>: the head of a linked list (the current “collection” at this node).</w:t>
+      </w:r>
+      <w:r>
+        <w:br/>
+      </w:r>
+      <w:r>
+        <w:t xml:space="preserve">      </w:t>
+      </w:r>
+      <w:r>
+        <w:t xml:space="preserve">– left, right: pointers to child </w:t>
+      </w:r>
+      <w:proofErr w:type="spellStart"/>
+      <w:r>
+        <w:t>TreeNodes</w:t>
+      </w:r>
+      <w:proofErr w:type="spellEnd"/>
+      <w:r>
+        <w:t>.</w:t>
       </w:r>
       <w:r>
         <w:br/>
@@ -657,7 +896,23 @@
         <w:t>memorization</w:t>
       </w:r>
       <w:r>
-        <w:t xml:space="preserve"> dictionary “memo” that maps TreeNode objects to a result: (best_count, choice), where choice is either "self" or "children".</w:t>
+        <w:t xml:space="preserve"> dictionary “memo” that maps </w:t>
+      </w:r>
+      <w:proofErr w:type="spellStart"/>
+      <w:r>
+        <w:t>TreeNode</w:t>
+      </w:r>
+      <w:proofErr w:type="spellEnd"/>
+      <w:r>
+        <w:t xml:space="preserve"> objects to a result: (</w:t>
+      </w:r>
+      <w:proofErr w:type="spellStart"/>
+      <w:r>
+        <w:t>best_count</w:t>
+      </w:r>
+      <w:proofErr w:type="spellEnd"/>
+      <w:r>
+        <w:t>, choice), where choice is either "self" or "children".</w:t>
       </w:r>
     </w:p>
     <w:p>
@@ -682,19 +937,67 @@
     </w:p>
     <w:p>
       <w:r>
-        <w:t>• build_linked_list(values): Converts a Python list into a linked list.</w:t>
-      </w:r>
-      <w:r>
-        <w:br/>
-        <w:t>• linked_list_to_list(head): Converts a linked list back into a Python list.</w:t>
-      </w:r>
-      <w:r>
-        <w:br/>
-        <w:t>• can_split_list(list_head): Returns True if any element in the list is greater than 1, meaning further splitting is possible.</w:t>
-      </w:r>
-      <w:r>
-        <w:br/>
-        <w:t>• split_list(list_head): For each element x in the list:</w:t>
+        <w:t xml:space="preserve">• </w:t>
+      </w:r>
+      <w:proofErr w:type="spellStart"/>
+      <w:r>
+        <w:t>build_linked_list</w:t>
+      </w:r>
+      <w:proofErr w:type="spellEnd"/>
+      <w:r>
+        <w:t>(values): Converts a Python list into a linked list.</w:t>
+      </w:r>
+      <w:r>
+        <w:br/>
+        <w:t xml:space="preserve">• </w:t>
+      </w:r>
+      <w:proofErr w:type="spellStart"/>
+      <w:r>
+        <w:t>linked_list_to_list</w:t>
+      </w:r>
+      <w:proofErr w:type="spellEnd"/>
+      <w:r>
+        <w:t>(head): Converts a linked list back into a Python list.</w:t>
+      </w:r>
+      <w:r>
+        <w:br/>
+        <w:t xml:space="preserve">• </w:t>
+      </w:r>
+      <w:proofErr w:type="spellStart"/>
+      <w:r>
+        <w:t>can_split_list</w:t>
+      </w:r>
+      <w:proofErr w:type="spellEnd"/>
+      <w:r>
+        <w:t>(</w:t>
+      </w:r>
+      <w:proofErr w:type="spellStart"/>
+      <w:r>
+        <w:t>list_head</w:t>
+      </w:r>
+      <w:proofErr w:type="spellEnd"/>
+      <w:r>
+        <w:t>): Returns True if any element in the list is greater than 1, meaning further splitting is possible.</w:t>
+      </w:r>
+      <w:r>
+        <w:br/>
+        <w:t xml:space="preserve">• </w:t>
+      </w:r>
+      <w:proofErr w:type="spellStart"/>
+      <w:r>
+        <w:t>split_list</w:t>
+      </w:r>
+      <w:proofErr w:type="spellEnd"/>
+      <w:r>
+        <w:t>(</w:t>
+      </w:r>
+      <w:proofErr w:type="spellStart"/>
+      <w:r>
+        <w:t>list_head</w:t>
+      </w:r>
+      <w:proofErr w:type="spellEnd"/>
+      <w:r>
+        <w:t>): For each element x in the list:</w:t>
       </w:r>
       <w:r>
         <w:br/>
@@ -719,7 +1022,21 @@
     </w:p>
     <w:p>
       <w:r>
-        <w:t>The function _build_children recursively splits a node into its left and right children as long as its list can be split, thereby creating a binary tree whose leaves are lists of 0s and 1s (and possibl</w:t>
+        <w:t>•</w:t>
+      </w:r>
+      <w:r>
+        <w:t>_</w:t>
+      </w:r>
+      <w:proofErr w:type="spellStart"/>
+      <w:r>
+        <w:t>build_children</w:t>
+      </w:r>
+      <w:proofErr w:type="spellEnd"/>
+      <w:r>
+        <w:t>(node)</w:t>
+      </w:r>
+      <w:r>
+        <w:t xml:space="preserve"> recursively splits a node into its left and right children as long as its list can be split, thereby creating a binary tree whose leaves are lists of 0s and 1s (and possibl</w:t>
       </w:r>
       <w:r>
         <w:t>e</w:t>
@@ -744,7 +1061,23 @@
     </w:p>
     <w:p>
       <w:r>
-        <w:t>Once the splitting tree is built, the goal is to choose a set of TreeNodes to treat as partitions such that:</w:t>
+        <w:t xml:space="preserve">Once the splitting tree is built, the goal is to choose a set of </w:t>
+      </w:r>
+      <w:proofErr w:type="spellStart"/>
+      <w:r>
+        <w:t>TreeNodes</w:t>
+      </w:r>
+      <w:proofErr w:type="spellEnd"/>
+      <w:r>
+        <w:t xml:space="preserve"> to treat as partitions such </w:t>
+      </w:r>
+      <w:proofErr w:type="gramStart"/>
+      <w:r>
+        <w:t>that</w:t>
+      </w:r>
+      <w:proofErr w:type="gramEnd"/>
+      <w:r>
+        <w:t>:</w:t>
       </w:r>
     </w:p>
     <w:p>
@@ -767,15 +1100,47 @@
     </w:p>
     <w:p>
       <w:r>
-        <w:t>• list_sum_and_diversity(list_head): Computes total sum and diversity (count of positive entries) for a list.</w:t>
-      </w:r>
-      <w:r>
-        <w:br/>
-        <w:t>• compute_best_partitions(node, k, l, memo):</w:t>
-      </w:r>
-      <w:r>
-        <w:br/>
-        <w:t>– At a given TreeNode, compute:</w:t>
+        <w:t xml:space="preserve">• </w:t>
+      </w:r>
+      <w:proofErr w:type="spellStart"/>
+      <w:r>
+        <w:t>list_sum_and_diversity</w:t>
+      </w:r>
+      <w:proofErr w:type="spellEnd"/>
+      <w:r>
+        <w:t>(</w:t>
+      </w:r>
+      <w:proofErr w:type="spellStart"/>
+      <w:r>
+        <w:t>list_head</w:t>
+      </w:r>
+      <w:proofErr w:type="spellEnd"/>
+      <w:r>
+        <w:t>): Computes total sum and diversity (count of positive entries) for a list.</w:t>
+      </w:r>
+      <w:r>
+        <w:br/>
+        <w:t xml:space="preserve">• </w:t>
+      </w:r>
+      <w:proofErr w:type="spellStart"/>
+      <w:r>
+        <w:t>compute_best_partitions</w:t>
+      </w:r>
+      <w:proofErr w:type="spellEnd"/>
+      <w:r>
+        <w:t>(node, k, l, memo):</w:t>
+      </w:r>
+      <w:r>
+        <w:br/>
+        <w:t xml:space="preserve">– At a given </w:t>
+      </w:r>
+      <w:proofErr w:type="spellStart"/>
+      <w:r>
+        <w:t>TreeNode</w:t>
+      </w:r>
+      <w:proofErr w:type="spellEnd"/>
+      <w:r>
+        <w:t>, compute:</w:t>
       </w:r>
       <w:r>
         <w:br/>
@@ -791,13 +1156,37 @@
       </w:r>
       <w:r>
         <w:br/>
-        <w:t>– Store the result (best_count, choice) in memo and return it.</w:t>
+        <w:t>– Store the result (</w:t>
+      </w:r>
+      <w:proofErr w:type="spellStart"/>
+      <w:r>
+        <w:t>best_count</w:t>
+      </w:r>
+      <w:proofErr w:type="spellEnd"/>
+      <w:r>
+        <w:t>, choice) in memo and return it.</w:t>
       </w:r>
     </w:p>
     <w:p>
       <w:r>
         <w:lastRenderedPageBreak/>
-        <w:t>• collect_partitions(node, memo, partitions):</w:t>
+        <w:t xml:space="preserve">• </w:t>
+      </w:r>
+      <w:proofErr w:type="spellStart"/>
+      <w:r>
+        <w:t>collect_</w:t>
+      </w:r>
+      <w:proofErr w:type="gramStart"/>
+      <w:r>
+        <w:t>partitions</w:t>
+      </w:r>
+      <w:proofErr w:type="spellEnd"/>
+      <w:r>
+        <w:t>(</w:t>
+      </w:r>
+      <w:proofErr w:type="gramEnd"/>
+      <w:r>
+        <w:t>node, memo, partitions):</w:t>
       </w:r>
       <w:r>
         <w:br/>
@@ -820,7 +1209,23 @@
     </w:p>
     <w:p>
       <w:r>
-        <w:t xml:space="preserve">The main driver function, tree_based_dp_algorithm(values, k, l): </w:t>
+        <w:t xml:space="preserve">The main driver function, </w:t>
+      </w:r>
+      <w:proofErr w:type="spellStart"/>
+      <w:r>
+        <w:t>tree_based_dp_</w:t>
+      </w:r>
+      <w:proofErr w:type="gramStart"/>
+      <w:r>
+        <w:t>algorithm</w:t>
+      </w:r>
+      <w:proofErr w:type="spellEnd"/>
+      <w:r>
+        <w:t>(</w:t>
+      </w:r>
+      <w:proofErr w:type="gramEnd"/>
+      <w:r>
+        <w:t xml:space="preserve">values, k, l): </w:t>
       </w:r>
     </w:p>
     <w:p>
@@ -862,7 +1267,15 @@
         </w:numPr>
       </w:pPr>
       <w:r>
-        <w:t>Runs compute_best_partitions on the tree’s root.</w:t>
+        <w:t xml:space="preserve">Runs </w:t>
+      </w:r>
+      <w:proofErr w:type="spellStart"/>
+      <w:r>
+        <w:t>compute_best_partitions</w:t>
+      </w:r>
+      <w:proofErr w:type="spellEnd"/>
+      <w:r>
+        <w:t xml:space="preserve"> on the tree’s root.</w:t>
       </w:r>
     </w:p>
     <w:p>
@@ -873,7 +1286,15 @@
         </w:numPr>
       </w:pPr>
       <w:r>
-        <w:t>Calls collect_partitions to generate the list of partitions based on the DP choices.</w:t>
+        <w:t xml:space="preserve">Calls </w:t>
+      </w:r>
+      <w:proofErr w:type="spellStart"/>
+      <w:r>
+        <w:t>collect_partitions</w:t>
+      </w:r>
+      <w:proofErr w:type="spellEnd"/>
+      <w:r>
+        <w:t xml:space="preserve"> to generate the list of partitions based on the DP choices.</w:t>
       </w:r>
     </w:p>
     <w:p>
@@ -884,7 +1305,15 @@
         </w:numPr>
       </w:pPr>
       <w:r>
-        <w:t>Verifies reconstruction using check_reconstruction_from_partitions.</w:t>
+        <w:t xml:space="preserve">Verifies reconstruction using </w:t>
+      </w:r>
+      <w:proofErr w:type="spellStart"/>
+      <w:r>
+        <w:t>check_reconstruction_from_partitions</w:t>
+      </w:r>
+      <w:proofErr w:type="spellEnd"/>
+      <w:r>
+        <w:t>.</w:t>
       </w:r>
     </w:p>
     <w:p>
@@ -900,7 +1329,15 @@
     </w:p>
     <w:p>
       <w:r>
-        <w:t xml:space="preserve">The main block functions similarly to Algorithm 1’s script: it asks for user inputs, runs the algorithm, prints out the results, and uses timeit to collect average run time over a fixed number of runs. </w:t>
+        <w:t xml:space="preserve">The main block functions similarly to Algorithm 1’s script: it asks for user inputs, runs the algorithm, prints out the results, and uses </w:t>
+      </w:r>
+      <w:proofErr w:type="spellStart"/>
+      <w:r>
+        <w:t>timeit</w:t>
+      </w:r>
+      <w:proofErr w:type="spellEnd"/>
+      <w:r>
+        <w:t xml:space="preserve"> to collect average run time over a fixed number of runs. </w:t>
       </w:r>
     </w:p>
     <w:p>
@@ -924,7 +1361,23 @@
     </w:p>
     <w:p>
       <w:r>
-        <w:t>• For any candidate node (TreeNode), before it can be chosen under the "self" option, list_sum_and_diversity checks whether its linked list meets sum ≥ k and diversity ≥ l.</w:t>
+        <w:t>• For any candidate node (</w:t>
+      </w:r>
+      <w:proofErr w:type="spellStart"/>
+      <w:r>
+        <w:t>TreeNode</w:t>
+      </w:r>
+      <w:proofErr w:type="spellEnd"/>
+      <w:r>
+        <w:t xml:space="preserve">), before it can be chosen under the "self" option, </w:t>
+      </w:r>
+      <w:proofErr w:type="spellStart"/>
+      <w:r>
+        <w:t>list_sum_and_diversity</w:t>
+      </w:r>
+      <w:proofErr w:type="spellEnd"/>
+      <w:r>
+        <w:t xml:space="preserve"> checks whether its linked list meets sum ≥ k and diversity ≥ l.</w:t>
       </w:r>
       <w:r>
         <w:br/>
@@ -946,7 +1399,15 @@
       </w:r>
       <w:r>
         <w:br/>
-        <w:t xml:space="preserve">• The function check_reconstruction_from_partitions verifies that the final set of partitions reconstructs the original Python list exactly. </w:t>
+        <w:t xml:space="preserve">• The function </w:t>
+      </w:r>
+      <w:proofErr w:type="spellStart"/>
+      <w:r>
+        <w:t>check_reconstruction_from_partitions</w:t>
+      </w:r>
+      <w:proofErr w:type="spellEnd"/>
+      <w:r>
+        <w:t xml:space="preserve"> verifies that the final set of partitions reconstructs the original Python list exactly. </w:t>
       </w:r>
     </w:p>
     <w:p>
@@ -1059,7 +1520,15 @@
     </w:p>
     <w:p>
       <w:r>
-        <w:t>• As argued earlier, the time complexity is approximately O(n * S), where S is the total sum of the values.</w:t>
+        <w:t xml:space="preserve">• As argued earlier, the time complexity is approximately </w:t>
+      </w:r>
+      <w:proofErr w:type="gramStart"/>
+      <w:r>
+        <w:t>O(</w:t>
+      </w:r>
+      <w:proofErr w:type="gramEnd"/>
+      <w:r>
+        <w:t>n * S), where S is the total sum of the values.</w:t>
       </w:r>
       <w:r>
         <w:br/>
@@ -1081,7 +1550,15 @@
       </w:r>
       <w:r>
         <w:br/>
-        <w:t xml:space="preserve">– The height of the tree is bounded by O(log M), where M is the maximum value in the </w:t>
+        <w:t xml:space="preserve">– The height of the tree is bounded by </w:t>
+      </w:r>
+      <w:proofErr w:type="gramStart"/>
+      <w:r>
+        <w:t>O(</w:t>
+      </w:r>
+      <w:proofErr w:type="gramEnd"/>
+      <w:r>
+        <w:t xml:space="preserve">log M), where M is the maximum value in the </w:t>
       </w:r>
       <w:r>
         <w:lastRenderedPageBreak/>
@@ -1098,7 +1575,15 @@
       </w:r>
       <w:r>
         <w:br/>
-        <w:t>– In the worst case, each level doubles the number of nodes, and the tree can have O(2^h) nodes where h = O(log M). But the total sum S and the per-index halving behavior limit how many meaningful nodes exist. Conceptually, the cost can still be significant when values are large and the tree is deep.</w:t>
+        <w:t xml:space="preserve">– In the worst case, each level doubles the number of nodes, and the tree can have O(2^h) nodes where h = </w:t>
+      </w:r>
+      <w:proofErr w:type="gramStart"/>
+      <w:r>
+        <w:t>O(</w:t>
+      </w:r>
+      <w:proofErr w:type="gramEnd"/>
+      <w:r>
+        <w:t>log M). But the total sum S and the per-index halving behavior limit how many meaningful nodes exist. Conceptually, the cost can still be significant when values are large and the tree is deep.</w:t>
       </w:r>
     </w:p>
     <w:p>
@@ -1107,7 +1592,15 @@
       </w:r>
       <w:r>
         <w:br/>
-        <w:t xml:space="preserve">– compute_best_partitions visits each node once and does a constant amount of work per node, provided </w:t>
+        <w:t xml:space="preserve">– </w:t>
+      </w:r>
+      <w:proofErr w:type="spellStart"/>
+      <w:r>
+        <w:t>compute_best_partitions</w:t>
+      </w:r>
+      <w:proofErr w:type="spellEnd"/>
+      <w:r>
+        <w:t xml:space="preserve"> visits each node once and does a constant amount of work per node, provided </w:t>
       </w:r>
       <w:r>
         <w:t>memorization</w:t>
@@ -1117,12 +1610,28 @@
       </w:r>
       <w:r>
         <w:br/>
-        <w:t>– collect_partitions also visits only nodes that are chosen or on paths to chosen nodes.</w:t>
-      </w:r>
-    </w:p>
-    <w:p>
-      <w:r>
-        <w:t>In rough terms, the overall complexity of Algorithm 2 can be thought of as O(T * n), where T is the number of nodes in the splitting tree. In worst cases, T may be large relative to S, especially when values are large and the halving structure expands.</w:t>
+        <w:t xml:space="preserve">– </w:t>
+      </w:r>
+      <w:proofErr w:type="spellStart"/>
+      <w:r>
+        <w:t>collect_partitions</w:t>
+      </w:r>
+      <w:proofErr w:type="spellEnd"/>
+      <w:r>
+        <w:t xml:space="preserve"> also visits only nodes that are chosen or on paths to chosen nodes.</w:t>
+      </w:r>
+    </w:p>
+    <w:p>
+      <w:r>
+        <w:t xml:space="preserve">In rough terms, the overall complexity of Algorithm 2 can be thought of as </w:t>
+      </w:r>
+      <w:proofErr w:type="gramStart"/>
+      <w:r>
+        <w:t>O(</w:t>
+      </w:r>
+      <w:proofErr w:type="gramEnd"/>
+      <w:r>
+        <w:t>T * n), where T is the number of nodes in the splitting tree. In worst cases, T may be large relative to S, especially when values are large and the halving structure expands.</w:t>
       </w:r>
     </w:p>
     <w:p>
@@ -1236,7 +1745,15 @@
       </w:r>
       <w:r>
         <w:br/>
-        <w:t>• It can miss better global solutions that would require taking fewer units from a large index early on in order to “save” capacity for later partitions.</w:t>
+        <w:t xml:space="preserve">• It can miss better global solutions that would require taking fewer units from a large index early on </w:t>
+      </w:r>
+      <w:proofErr w:type="gramStart"/>
+      <w:r>
+        <w:t>in order to</w:t>
+      </w:r>
+      <w:proofErr w:type="gramEnd"/>
+      <w:r>
+        <w:t xml:space="preserve"> “save” capacity for later partitions.</w:t>
       </w:r>
       <w:r>
         <w:br/>
@@ -1437,7 +1954,14 @@
       </w:r>
       <w:r>
         <w:br/>
-        <w:t>Example: values a random list of length n with moderate-to-large values, non-trivial k and l.</w:t>
+      </w:r>
+      <w:proofErr w:type="gramStart"/>
+      <w:r>
+        <w:t>Example:</w:t>
+      </w:r>
+      <w:proofErr w:type="gramEnd"/>
+      <w:r>
+        <w:t xml:space="preserve"> values a random list of length n with moderate-to-large values, non-trivial k and l.</w:t>
       </w:r>
       <w:r>
         <w:br/>
@@ -1679,7 +2203,39 @@
       </w:r>
       <w:r>
         <w:br/>
-        <w:t xml:space="preserve">• For Algorithm 1, helpers like partition_sum, partition_diversity, check_reconstruction, and build_one_partition keep the code modular and clarify each conceptual step (measuring partition quality, verifying reconstruction, and constructing one partition at a time). </w:t>
+        <w:t xml:space="preserve">• For Algorithm 1, helpers like </w:t>
+      </w:r>
+      <w:proofErr w:type="spellStart"/>
+      <w:r>
+        <w:t>partition_sum</w:t>
+      </w:r>
+      <w:proofErr w:type="spellEnd"/>
+      <w:r>
+        <w:t xml:space="preserve">, </w:t>
+      </w:r>
+      <w:proofErr w:type="spellStart"/>
+      <w:r>
+        <w:t>partition_diversity</w:t>
+      </w:r>
+      <w:proofErr w:type="spellEnd"/>
+      <w:r>
+        <w:t xml:space="preserve">, </w:t>
+      </w:r>
+      <w:proofErr w:type="spellStart"/>
+      <w:r>
+        <w:t>check_reconstruction</w:t>
+      </w:r>
+      <w:proofErr w:type="spellEnd"/>
+      <w:r>
+        <w:t xml:space="preserve">, and </w:t>
+      </w:r>
+      <w:proofErr w:type="spellStart"/>
+      <w:r>
+        <w:t>build_one_partition</w:t>
+      </w:r>
+      <w:proofErr w:type="spellEnd"/>
+      <w:r>
+        <w:t xml:space="preserve"> keep the code modular and clarify each conceptual step (measuring partition quality, verifying reconstruction, and constructing one partition at a time). </w:t>
       </w:r>
     </w:p>
     <w:p>
@@ -1938,7 +2494,15 @@
     </w:p>
     <w:p>
       <w:r>
-        <w:t>In practice, the greedy algorithm often produced as many or more partitions than the tree-based algorithm, des</w:t>
+        <w:t xml:space="preserve">In practice, the greedy algorithm often </w:t>
+      </w:r>
+      <w:proofErr w:type="gramStart"/>
+      <w:r>
+        <w:t>produced as</w:t>
+      </w:r>
+      <w:proofErr w:type="gramEnd"/>
+      <w:r>
+        <w:t xml:space="preserve"> many or more partitions than the tree-based algorithm, des</w:t>
       </w:r>
       <w:r>
         <w:t>pi</w:t>
@@ -4896,6 +5460,7 @@
   <w:style w:type="character" w:default="1" w:styleId="DefaultParagraphFont">
     <w:name w:val="Default Paragraph Font"/>
     <w:uiPriority w:val="1"/>
+    <w:semiHidden/>
     <w:unhideWhenUsed/>
   </w:style>
   <w:style w:type="table" w:default="1" w:styleId="TableNormal">

</xml_diff>